<commit_message>
Update index.html and add project images (churn.png, logo_pantun.png)
</commit_message>
<xml_diff>
--- a/Dokumen/RESUME_AE_ATS.docx
+++ b/Dokumen/RESUME_AE_ATS.docx
@@ -1,6 +1,6 @@
 
 <file path=word/document.xml><?xml version="1.0" encoding="utf-8"?>
-<w:document xmlns:wpc="http://schemas.microsoft.com/office/word/2010/wordprocessingCanvas" xmlns:cx="http://schemas.microsoft.com/office/drawing/2014/chartex" xmlns:cx1="http://schemas.microsoft.com/office/drawing/2015/9/8/chartex" xmlns:cx2="http://schemas.microsoft.com/office/drawing/2015/10/21/chartex" xmlns:cx3="http://schemas.microsoft.com/office/drawing/2016/5/9/chartex" xmlns:cx4="http://schemas.microsoft.com/office/drawing/2016/5/10/chartex" xmlns:cx5="http://schemas.microsoft.com/office/drawing/2016/5/11/chartex" xmlns:cx6="http://schemas.microsoft.com/office/drawing/2016/5/12/chartex" xmlns:cx7="http://schemas.microsoft.com/office/drawing/2016/5/13/chartex" xmlns:cx8="http://schemas.microsoft.com/office/drawing/2016/5/14/chartex" xmlns:mc="http://schemas.openxmlformats.org/markup-compatibility/2006" xmlns:aink="http://schemas.microsoft.com/office/drawing/2016/ink" xmlns:am3d="http://schemas.microsoft.com/office/drawing/2017/model3d" xmlns:o="urn:schemas-microsoft-com:office:office" xmlns:oel="http://schemas.microsoft.com/office/2019/extlst" xmlns:r="http://schemas.openxmlformats.org/officeDocument/2006/relationships" xmlns:m="http://schemas.openxmlformats.org/officeDocument/2006/math" xmlns:v="urn:schemas-microsoft-com:vml" xmlns:wp14="http://schemas.microsoft.com/office/word/2010/wordprocessingDrawing" xmlns:wp="http://schemas.openxmlformats.org/drawingml/2006/wordprocessingDrawing" xmlns:w10="urn:schemas-microsoft-com:office:word" xmlns:w="http://schemas.openxmlformats.org/wordprocessingml/2006/main" xmlns:w14="http://schemas.microsoft.com/office/word/2010/wordml" xmlns:w15="http://schemas.microsoft.com/office/word/2012/wordml" xmlns:w16cei="http://schemas.microsoft.com/office/word/2026/wordml/cei" xmlns:w16cex="http://schemas.microsoft.com/office/word/2018/wordml/cex" xmlns:w16cid="http://schemas.microsoft.com/office/word/2016/wordml/cid" xmlns:w16="http://schemas.microsoft.com/office/word/2018/wordml" xmlns:w16du="http://schemas.microsoft.com/office/word/2023/wordml/word16du" xmlns:w16sdtdh="http://schemas.microsoft.com/office/word/2020/wordml/sdtdatahash" xmlns:w16sdtfl="http://schemas.microsoft.com/office/word/2024/wordml/sdtformatlock" xmlns:w16se="http://schemas.microsoft.com/office/word/2015/wordml/symex" xmlns:wpg="http://schemas.microsoft.com/office/word/2010/wordprocessingGroup" xmlns:wpi="http://schemas.microsoft.com/office/word/2010/wordprocessingInk" xmlns:wne="http://schemas.microsoft.com/office/word/2006/wordml" xmlns:wps="http://schemas.microsoft.com/office/word/2010/wordprocessingShape" mc:Ignorable="w14 w15 w16se w16cid w16 w16cex w16sdtdh w16sdtfl w16du wp14">
+<w:document xmlns:wpc="http://schemas.microsoft.com/office/word/2010/wordprocessingCanvas" xmlns:cx="http://schemas.microsoft.com/office/drawing/2014/chartex" xmlns:cx1="http://schemas.microsoft.com/office/drawing/2015/9/8/chartex" xmlns:cx2="http://schemas.microsoft.com/office/drawing/2015/10/21/chartex" xmlns:cx3="http://schemas.microsoft.com/office/drawing/2016/5/9/chartex" xmlns:cx4="http://schemas.microsoft.com/office/drawing/2016/5/10/chartex" xmlns:cx5="http://schemas.microsoft.com/office/drawing/2016/5/11/chartex" xmlns:cx6="http://schemas.microsoft.com/office/drawing/2016/5/12/chartex" xmlns:cx7="http://schemas.microsoft.com/office/drawing/2016/5/13/chartex" xmlns:cx8="http://schemas.microsoft.com/office/drawing/2016/5/14/chartex" xmlns:mc="http://schemas.openxmlformats.org/markup-compatibility/2006" xmlns:aink="http://schemas.microsoft.com/office/drawing/2016/ink" xmlns:am3d="http://schemas.microsoft.com/office/drawing/2017/model3d" xmlns:o="urn:schemas-microsoft-com:office:office" xmlns:oel="http://schemas.microsoft.com/office/2019/extlst" xmlns:r="http://schemas.openxmlformats.org/officeDocument/2006/relationships" xmlns:m="http://schemas.openxmlformats.org/officeDocument/2006/math" xmlns:v="urn:schemas-microsoft-com:vml" xmlns:wp14="http://schemas.microsoft.com/office/word/2010/wordprocessingDrawing" xmlns:wp="http://schemas.openxmlformats.org/drawingml/2006/wordprocessingDrawing" xmlns:w10="urn:schemas-microsoft-com:office:word" xmlns:w="http://schemas.openxmlformats.org/wordprocessingml/2006/main" xmlns:w14="http://schemas.microsoft.com/office/word/2010/wordml" xmlns:w15="http://schemas.microsoft.com/office/word/2012/wordml" xmlns:w16cex="http://schemas.microsoft.com/office/word/2018/wordml/cex" xmlns:w16cid="http://schemas.microsoft.com/office/word/2016/wordml/cid" xmlns:w16="http://schemas.microsoft.com/office/word/2018/wordml" xmlns:w16du="http://schemas.microsoft.com/office/word/2023/wordml/word16du" xmlns:w16sdtdh="http://schemas.microsoft.com/office/word/2020/wordml/sdtdatahash" xmlns:w16sdtfl="http://schemas.microsoft.com/office/word/2024/wordml/sdtformatlock" xmlns:w16se="http://schemas.microsoft.com/office/word/2015/wordml/symex" xmlns:wpg="http://schemas.microsoft.com/office/word/2010/wordprocessingGroup" xmlns:wpi="http://schemas.microsoft.com/office/word/2010/wordprocessingInk" xmlns:wne="http://schemas.microsoft.com/office/word/2006/wordml" xmlns:wps="http://schemas.microsoft.com/office/word/2010/wordprocessingShape" mc:Ignorable="w14 w15 w16se w16cid w16 w16cex w16sdtdh w16sdtfl w16du wp14">
   <w:body>
     <w:p>
       <w:pPr>
@@ -173,25 +173,7 @@
             <w:color w:val="auto"/>
             <w:u w:val="none"/>
           </w:rPr>
-          <w:t>Link</w:t>
-        </w:r>
-        <w:r>
-          <w:rPr>
-            <w:rStyle w:val="Hyperlink"/>
-            <w:rFonts w:asciiTheme="minorBidi" w:hAnsiTheme="minorBidi" w:cstheme="minorBidi"/>
-            <w:color w:val="auto"/>
-            <w:u w:val="none"/>
-          </w:rPr>
-          <w:t>e</w:t>
-        </w:r>
-        <w:r>
-          <w:rPr>
-            <w:rStyle w:val="Hyperlink"/>
-            <w:rFonts w:asciiTheme="minorBidi" w:hAnsiTheme="minorBidi" w:cstheme="minorBidi"/>
-            <w:color w:val="auto"/>
-            <w:u w:val="none"/>
-          </w:rPr>
-          <w:t>dIn</w:t>
+          <w:t>LinkedIn</w:t>
         </w:r>
       </w:hyperlink>
       <w:r>
@@ -298,7 +280,21 @@
           <w:rFonts w:asciiTheme="minorBidi" w:hAnsiTheme="minorBidi" w:cstheme="minorBidi"/>
           <w:color w:val="000000" w:themeColor="text1"/>
         </w:rPr>
-        <w:t xml:space="preserve">Dependable, responsible, and detail-oriented Semester 6 Bachelor of Information Systems (Hons.) Business Computing student with a current CGPA of 3.38. Practical academic experience in SQL and database management, data cleaning and preprocessing, predictive analytics, and business intelligence dashboarding using Power BI. </w:t>
+        <w:t>Dependable, responsible, and detail-oriented Semester 6 Bachelor of Information Systems (Hons.) Business Computing student with a current CGPA of 3.</w:t>
+      </w:r>
+      <w:r>
+        <w:rPr>
+          <w:rFonts w:asciiTheme="minorBidi" w:hAnsiTheme="minorBidi" w:cstheme="minorBidi"/>
+          <w:color w:val="000000" w:themeColor="text1"/>
+        </w:rPr>
+        <w:t>46</w:t>
+      </w:r>
+      <w:r>
+        <w:rPr>
+          <w:rFonts w:asciiTheme="minorBidi" w:hAnsiTheme="minorBidi" w:cstheme="minorBidi"/>
+          <w:color w:val="000000" w:themeColor="text1"/>
+        </w:rPr>
+        <w:t xml:space="preserve">. Practical academic experience in SQL and database management, data cleaning and preprocessing, predictive analytics, and business intelligence dashboarding using Power BI. </w:t>
       </w:r>
       <w:r>
         <w:rPr>
@@ -371,27 +367,7 @@
           <w:bCs/>
           <w:color w:val="000000" w:themeColor="text1"/>
         </w:rPr>
-        <w:t xml:space="preserve">Universiti </w:t>
-      </w:r>
-      <w:proofErr w:type="spellStart"/>
-      <w:r>
-        <w:rPr>
-          <w:rFonts w:asciiTheme="minorBidi" w:hAnsiTheme="minorBidi" w:cstheme="minorBidi"/>
-          <w:b/>
-          <w:bCs/>
-          <w:color w:val="000000" w:themeColor="text1"/>
-        </w:rPr>
-        <w:t>Teknologi</w:t>
-      </w:r>
-      <w:proofErr w:type="spellEnd"/>
-      <w:r>
-        <w:rPr>
-          <w:rFonts w:asciiTheme="minorBidi" w:hAnsiTheme="minorBidi" w:cstheme="minorBidi"/>
-          <w:b/>
-          <w:bCs/>
-          <w:color w:val="000000" w:themeColor="text1"/>
-        </w:rPr>
-        <w:t xml:space="preserve"> MARA (UiTM), Kuala Terengganu</w:t>
+        <w:t>Universiti Teknologi MARA (UiTM), Kuala Terengganu</w:t>
       </w:r>
       <w:r>
         <w:rPr>
@@ -440,7 +416,21 @@
           <w:rFonts w:asciiTheme="minorBidi" w:hAnsiTheme="minorBidi" w:cstheme="minorBidi"/>
           <w:color w:val="000000" w:themeColor="text1"/>
         </w:rPr>
-        <w:t>CGPA: 3.38 | Current Semester: 6</w:t>
+        <w:t>CGPA: 3.</w:t>
+      </w:r>
+      <w:r>
+        <w:rPr>
+          <w:rFonts w:asciiTheme="minorBidi" w:hAnsiTheme="minorBidi" w:cstheme="minorBidi"/>
+          <w:color w:val="000000" w:themeColor="text1"/>
+        </w:rPr>
+        <w:t>46</w:t>
+      </w:r>
+      <w:r>
+        <w:rPr>
+          <w:rFonts w:asciiTheme="minorBidi" w:hAnsiTheme="minorBidi" w:cstheme="minorBidi"/>
+          <w:color w:val="000000" w:themeColor="text1"/>
+        </w:rPr>
+        <w:t xml:space="preserve"> | Current Semester: 6</w:t>
       </w:r>
     </w:p>
     <w:p>
@@ -509,27 +499,7 @@
           <w:iCs/>
           <w:color w:val="000000" w:themeColor="text1"/>
         </w:rPr>
-        <w:t xml:space="preserve">Sijil Tinggi </w:t>
-      </w:r>
-      <w:proofErr w:type="spellStart"/>
-      <w:r>
-        <w:rPr>
-          <w:rFonts w:asciiTheme="minorBidi" w:hAnsiTheme="minorBidi" w:cstheme="minorBidi"/>
-          <w:i/>
-          <w:iCs/>
-          <w:color w:val="000000" w:themeColor="text1"/>
-        </w:rPr>
-        <w:t>Persekolahan</w:t>
-      </w:r>
-      <w:proofErr w:type="spellEnd"/>
-      <w:r>
-        <w:rPr>
-          <w:rFonts w:asciiTheme="minorBidi" w:hAnsiTheme="minorBidi" w:cstheme="minorBidi"/>
-          <w:i/>
-          <w:iCs/>
-          <w:color w:val="000000" w:themeColor="text1"/>
-        </w:rPr>
-        <w:t xml:space="preserve"> Malaysia (STPM)</w:t>
+        <w:t>Sijil Tinggi Persekolahan Malaysia (STPM)</w:t>
       </w:r>
     </w:p>
     <w:p>
@@ -571,39 +541,7 @@
           <w:rFonts w:asciiTheme="minorBidi" w:hAnsiTheme="minorBidi" w:cstheme="minorBidi"/>
           <w:color w:val="000000" w:themeColor="text1"/>
         </w:rPr>
-        <w:t xml:space="preserve">Subjects: </w:t>
-      </w:r>
-      <w:proofErr w:type="spellStart"/>
-      <w:r>
-        <w:rPr>
-          <w:rFonts w:asciiTheme="minorBidi" w:hAnsiTheme="minorBidi" w:cstheme="minorBidi"/>
-          <w:color w:val="000000" w:themeColor="text1"/>
-        </w:rPr>
-        <w:t>Pengajian</w:t>
-      </w:r>
-      <w:proofErr w:type="spellEnd"/>
-      <w:r>
-        <w:rPr>
-          <w:rFonts w:asciiTheme="minorBidi" w:hAnsiTheme="minorBidi" w:cstheme="minorBidi"/>
-          <w:color w:val="000000" w:themeColor="text1"/>
-        </w:rPr>
-        <w:t xml:space="preserve"> Am, </w:t>
-      </w:r>
-      <w:proofErr w:type="spellStart"/>
-      <w:r>
-        <w:rPr>
-          <w:rFonts w:asciiTheme="minorBidi" w:hAnsiTheme="minorBidi" w:cstheme="minorBidi"/>
-          <w:color w:val="000000" w:themeColor="text1"/>
-        </w:rPr>
-        <w:t>Usuluddin</w:t>
-      </w:r>
-      <w:proofErr w:type="spellEnd"/>
-      <w:r>
-        <w:rPr>
-          <w:rFonts w:asciiTheme="minorBidi" w:hAnsiTheme="minorBidi" w:cstheme="minorBidi"/>
-          <w:color w:val="000000" w:themeColor="text1"/>
-        </w:rPr>
-        <w:t>, Arabic Language, and Syariah.</w:t>
+        <w:t>Subjects: Pengajian Am, Usuluddin, Arabic Language, and Syariah.</w:t>
       </w:r>
     </w:p>
     <w:p>
@@ -790,25 +728,14 @@
           <w:color w:val="000000" w:themeColor="text1"/>
         </w:rPr>
       </w:pPr>
-      <w:proofErr w:type="spellStart"/>
-      <w:r>
-        <w:rPr>
-          <w:rFonts w:asciiTheme="minorBidi" w:hAnsiTheme="minorBidi" w:cstheme="minorBidi"/>
-          <w:b/>
-          <w:bCs/>
-          <w:color w:val="000000" w:themeColor="text1"/>
-        </w:rPr>
-        <w:t>Pengajian</w:t>
-      </w:r>
-      <w:proofErr w:type="spellEnd"/>
-      <w:r>
-        <w:rPr>
-          <w:rFonts w:asciiTheme="minorBidi" w:hAnsiTheme="minorBidi" w:cstheme="minorBidi"/>
-          <w:b/>
-          <w:bCs/>
-          <w:color w:val="000000" w:themeColor="text1"/>
-        </w:rPr>
-        <w:t xml:space="preserve"> Am E-Learning System - Final Year Project</w:t>
+      <w:r>
+        <w:rPr>
+          <w:rFonts w:asciiTheme="minorBidi" w:hAnsiTheme="minorBidi" w:cstheme="minorBidi"/>
+          <w:b/>
+          <w:bCs/>
+          <w:color w:val="000000" w:themeColor="text1"/>
+        </w:rPr>
+        <w:t>Pengajian Am E-Learning System - Final Year Project</w:t>
       </w:r>
       <w:r>
         <w:rPr>
@@ -839,23 +766,70 @@
           <w:rFonts w:asciiTheme="minorBidi" w:hAnsiTheme="minorBidi" w:cstheme="minorBidi"/>
           <w:color w:val="000000" w:themeColor="text1"/>
         </w:rPr>
-        <w:t xml:space="preserve">Developed a web-based e-learning system to support Semester 1 STPM </w:t>
-      </w:r>
-      <w:proofErr w:type="spellStart"/>
-      <w:r>
-        <w:rPr>
-          <w:rFonts w:asciiTheme="minorBidi" w:hAnsiTheme="minorBidi" w:cstheme="minorBidi"/>
-          <w:color w:val="000000" w:themeColor="text1"/>
-        </w:rPr>
-        <w:t>Pengajian</w:t>
-      </w:r>
-      <w:proofErr w:type="spellEnd"/>
-      <w:r>
-        <w:rPr>
-          <w:rFonts w:asciiTheme="minorBidi" w:hAnsiTheme="minorBidi" w:cstheme="minorBidi"/>
-          <w:color w:val="000000" w:themeColor="text1"/>
-        </w:rPr>
-        <w:t xml:space="preserve"> Am students in learning and revision.</w:t>
+        <w:t>Developed a web-based e-learning system to support Semester 1 STPM Pengajian Am students in learning and revision.</w:t>
+      </w:r>
+    </w:p>
+    <w:p>
+      <w:pPr>
+        <w:pStyle w:val="ListParagraph"/>
+        <w:numPr>
+          <w:ilvl w:val="0"/>
+          <w:numId w:val="1"/>
+        </w:numPr>
+        <w:spacing w:after="40"/>
+        <w:rPr>
+          <w:rFonts w:asciiTheme="minorBidi" w:hAnsiTheme="minorBidi" w:cstheme="minorBidi"/>
+          <w:color w:val="000000" w:themeColor="text1"/>
+        </w:rPr>
+      </w:pPr>
+      <w:r>
+        <w:rPr>
+          <w:rFonts w:asciiTheme="minorBidi" w:hAnsiTheme="minorBidi" w:cstheme="minorBidi"/>
+          <w:color w:val="000000" w:themeColor="text1"/>
+        </w:rPr>
+        <w:t xml:space="preserve">Designed and implemented modules including learning materials, quizzes, progress tracking, discussion forum, and student performance monitoring. </w:t>
+      </w:r>
+    </w:p>
+    <w:p>
+      <w:pPr>
+        <w:pStyle w:val="ListParagraph"/>
+        <w:numPr>
+          <w:ilvl w:val="0"/>
+          <w:numId w:val="1"/>
+        </w:numPr>
+        <w:spacing w:after="40"/>
+        <w:rPr>
+          <w:rFonts w:asciiTheme="minorBidi" w:hAnsiTheme="minorBidi" w:cstheme="minorBidi"/>
+          <w:color w:val="000000" w:themeColor="text1"/>
+        </w:rPr>
+      </w:pPr>
+      <w:r>
+        <w:rPr>
+          <w:rFonts w:asciiTheme="minorBidi" w:hAnsiTheme="minorBidi" w:cstheme="minorBidi"/>
+          <w:color w:val="000000" w:themeColor="text1"/>
+        </w:rPr>
+        <w:t xml:space="preserve">Applied the ADDIE instructional design model and Constructivist Learning Theory to structure learning activities and encourage active student engagement. </w:t>
+      </w:r>
+    </w:p>
+    <w:p>
+      <w:pPr>
+        <w:pStyle w:val="ListParagraph"/>
+        <w:numPr>
+          <w:ilvl w:val="0"/>
+          <w:numId w:val="1"/>
+        </w:numPr>
+        <w:spacing w:after="40"/>
+        <w:rPr>
+          <w:rFonts w:asciiTheme="minorBidi" w:hAnsiTheme="minorBidi" w:cstheme="minorBidi"/>
+          <w:color w:val="000000" w:themeColor="text1"/>
+        </w:rPr>
+      </w:pPr>
+      <w:r>
+        <w:rPr>
+          <w:rFonts w:asciiTheme="minorBidi" w:hAnsiTheme="minorBidi" w:cstheme="minorBidi"/>
+          <w:color w:val="000000" w:themeColor="text1"/>
+        </w:rPr>
+        <w:t>Developed the system using PHP, MySQL, HTML, CSS, and JavaScript, including database design and user management functionality.</w:t>
       </w:r>
     </w:p>
     <w:p>
@@ -912,6 +886,70 @@
     </w:p>
     <w:p>
       <w:pPr>
+        <w:pStyle w:val="ListParagraph"/>
+        <w:numPr>
+          <w:ilvl w:val="0"/>
+          <w:numId w:val="1"/>
+        </w:numPr>
+        <w:spacing w:after="40"/>
+        <w:rPr>
+          <w:rFonts w:asciiTheme="minorBidi" w:hAnsiTheme="minorBidi" w:cstheme="minorBidi"/>
+          <w:color w:val="000000" w:themeColor="text1"/>
+        </w:rPr>
+      </w:pPr>
+      <w:r>
+        <w:rPr>
+          <w:rFonts w:asciiTheme="minorBidi" w:hAnsiTheme="minorBidi" w:cstheme="minorBidi"/>
+          <w:color w:val="000000" w:themeColor="text1"/>
+        </w:rPr>
+        <w:t xml:space="preserve">Integrated hardware components including ultrasonic sensors, LEDs, and Arduino microcontroller to simulate real-time parking availability detection. </w:t>
+      </w:r>
+    </w:p>
+    <w:p>
+      <w:pPr>
+        <w:pStyle w:val="ListParagraph"/>
+        <w:numPr>
+          <w:ilvl w:val="0"/>
+          <w:numId w:val="1"/>
+        </w:numPr>
+        <w:spacing w:after="40"/>
+        <w:rPr>
+          <w:rFonts w:asciiTheme="minorBidi" w:hAnsiTheme="minorBidi" w:cstheme="minorBidi"/>
+          <w:color w:val="000000" w:themeColor="text1"/>
+        </w:rPr>
+      </w:pPr>
+      <w:r>
+        <w:rPr>
+          <w:rFonts w:asciiTheme="minorBidi" w:hAnsiTheme="minorBidi" w:cstheme="minorBidi"/>
+          <w:color w:val="000000" w:themeColor="text1"/>
+        </w:rPr>
+        <w:lastRenderedPageBreak/>
+        <w:t xml:space="preserve">Designed the system workflow to reduce manual parking searching time and improve parking space management. </w:t>
+      </w:r>
+    </w:p>
+    <w:p>
+      <w:pPr>
+        <w:pStyle w:val="ListParagraph"/>
+        <w:numPr>
+          <w:ilvl w:val="0"/>
+          <w:numId w:val="1"/>
+        </w:numPr>
+        <w:spacing w:after="40"/>
+        <w:rPr>
+          <w:rFonts w:asciiTheme="minorBidi" w:hAnsiTheme="minorBidi" w:cstheme="minorBidi"/>
+          <w:color w:val="000000" w:themeColor="text1"/>
+        </w:rPr>
+      </w:pPr>
+      <w:r>
+        <w:rPr>
+          <w:rFonts w:asciiTheme="minorBidi" w:hAnsiTheme="minorBidi" w:cstheme="minorBidi"/>
+          <w:color w:val="000000" w:themeColor="text1"/>
+        </w:rPr>
+        <w:t>Tested prototype functionality through multiple parking scenarios to evaluate detection accuracy.</w:t>
+      </w:r>
+    </w:p>
+    <w:p>
+      <w:pPr>
         <w:tabs>
           <w:tab w:val="right" w:pos="9026"/>
         </w:tabs>
@@ -928,7 +966,7 @@
           <w:bCs/>
           <w:color w:val="000000" w:themeColor="text1"/>
         </w:rPr>
-        <w:t>Pantun Remix - Malay Pantun Learning Game</w:t>
+        <w:t>PowerBI Dashboard Challenge</w:t>
       </w:r>
       <w:r>
         <w:rPr>
@@ -938,44 +976,107 @@
           <w:color w:val="000000" w:themeColor="text1"/>
         </w:rPr>
         <w:tab/>
-        <w:t>2025</w:t>
-      </w:r>
-    </w:p>
-    <w:p>
-      <w:pPr>
-        <w:pStyle w:val="ListParagraph"/>
-        <w:numPr>
-          <w:ilvl w:val="0"/>
-          <w:numId w:val="1"/>
-        </w:numPr>
-        <w:spacing w:after="40"/>
-        <w:rPr>
-          <w:rFonts w:asciiTheme="minorBidi" w:hAnsiTheme="minorBidi" w:cstheme="minorBidi"/>
-          <w:color w:val="000000" w:themeColor="text1"/>
-        </w:rPr>
-      </w:pPr>
-      <w:r>
-        <w:rPr>
-          <w:rFonts w:asciiTheme="minorBidi" w:hAnsiTheme="minorBidi" w:cstheme="minorBidi"/>
-          <w:color w:val="000000" w:themeColor="text1"/>
-        </w:rPr>
-        <w:t xml:space="preserve">Created a web-based learning game that helps users learn and practise Malay pantun using PHP, CSS, and </w:t>
-      </w:r>
-      <w:proofErr w:type="spellStart"/>
-      <w:r>
-        <w:rPr>
-          <w:rFonts w:asciiTheme="minorBidi" w:hAnsiTheme="minorBidi" w:cstheme="minorBidi"/>
-          <w:color w:val="000000" w:themeColor="text1"/>
-        </w:rPr>
-        <w:t>Laragon</w:t>
-      </w:r>
-      <w:proofErr w:type="spellEnd"/>
-      <w:r>
-        <w:rPr>
-          <w:rFonts w:asciiTheme="minorBidi" w:hAnsiTheme="minorBidi" w:cstheme="minorBidi"/>
-          <w:color w:val="000000" w:themeColor="text1"/>
-        </w:rPr>
-        <w:t>.</w:t>
+        <w:t>2026</w:t>
+      </w:r>
+    </w:p>
+    <w:p>
+      <w:pPr>
+        <w:pStyle w:val="ListParagraph"/>
+        <w:numPr>
+          <w:ilvl w:val="0"/>
+          <w:numId w:val="1"/>
+        </w:numPr>
+        <w:spacing w:after="40"/>
+        <w:rPr>
+          <w:rFonts w:asciiTheme="minorBidi" w:hAnsiTheme="minorBidi" w:cstheme="minorBidi"/>
+          <w:color w:val="000000" w:themeColor="text1"/>
+        </w:rPr>
+      </w:pPr>
+      <w:r>
+        <w:rPr>
+          <w:rFonts w:asciiTheme="minorBidi" w:hAnsiTheme="minorBidi" w:cstheme="minorBidi"/>
+          <w:color w:val="000000" w:themeColor="text1"/>
+        </w:rPr>
+        <w:t>Developed an interactive Business Intelligence dashboard using Power BI and created predictive models for our university.</w:t>
+      </w:r>
+    </w:p>
+    <w:p>
+      <w:pPr>
+        <w:pStyle w:val="ListParagraph"/>
+        <w:numPr>
+          <w:ilvl w:val="0"/>
+          <w:numId w:val="1"/>
+        </w:numPr>
+        <w:spacing w:after="40"/>
+        <w:rPr>
+          <w:rFonts w:asciiTheme="minorBidi" w:hAnsiTheme="minorBidi" w:cstheme="minorBidi"/>
+          <w:color w:val="000000" w:themeColor="text1"/>
+        </w:rPr>
+      </w:pPr>
+      <w:r>
+        <w:rPr>
+          <w:rFonts w:asciiTheme="minorBidi" w:hAnsiTheme="minorBidi" w:cstheme="minorBidi"/>
+          <w:color w:val="000000" w:themeColor="text1"/>
+        </w:rPr>
+        <w:t xml:space="preserve">Performed data cleaning and transformation using </w:t>
+      </w:r>
+      <w:r>
+        <w:rPr>
+          <w:rFonts w:asciiTheme="minorBidi" w:hAnsiTheme="minorBidi" w:cstheme="minorBidi"/>
+          <w:b/>
+          <w:bCs/>
+          <w:color w:val="000000" w:themeColor="text1"/>
+        </w:rPr>
+        <w:t>Power Query</w:t>
+      </w:r>
+      <w:r>
+        <w:rPr>
+          <w:rFonts w:asciiTheme="minorBidi" w:hAnsiTheme="minorBidi" w:cstheme="minorBidi"/>
+          <w:color w:val="000000" w:themeColor="text1"/>
+        </w:rPr>
+        <w:t xml:space="preserve"> before creating visual analytics. </w:t>
+      </w:r>
+    </w:p>
+    <w:p>
+      <w:pPr>
+        <w:pStyle w:val="ListParagraph"/>
+        <w:numPr>
+          <w:ilvl w:val="0"/>
+          <w:numId w:val="1"/>
+        </w:numPr>
+        <w:spacing w:after="40"/>
+        <w:rPr>
+          <w:rFonts w:asciiTheme="minorBidi" w:hAnsiTheme="minorBidi" w:cstheme="minorBidi"/>
+          <w:color w:val="000000" w:themeColor="text1"/>
+        </w:rPr>
+      </w:pPr>
+      <w:r>
+        <w:rPr>
+          <w:rFonts w:asciiTheme="minorBidi" w:hAnsiTheme="minorBidi" w:cstheme="minorBidi"/>
+          <w:color w:val="000000" w:themeColor="text1"/>
+        </w:rPr>
+        <w:t xml:space="preserve">Designed dashboards with KPIs, charts, and predictive insights to support data-driven decision making. </w:t>
+      </w:r>
+    </w:p>
+    <w:p>
+      <w:pPr>
+        <w:pStyle w:val="ListParagraph"/>
+        <w:numPr>
+          <w:ilvl w:val="0"/>
+          <w:numId w:val="1"/>
+        </w:numPr>
+        <w:spacing w:after="40"/>
+        <w:rPr>
+          <w:rFonts w:asciiTheme="minorBidi" w:hAnsiTheme="minorBidi" w:cstheme="minorBidi"/>
+          <w:color w:val="000000" w:themeColor="text1"/>
+        </w:rPr>
+      </w:pPr>
+      <w:r>
+        <w:rPr>
+          <w:rFonts w:asciiTheme="minorBidi" w:hAnsiTheme="minorBidi" w:cstheme="minorBidi"/>
+          <w:color w:val="000000" w:themeColor="text1"/>
+        </w:rPr>
+        <w:t>Applied data modelling techniques and DAX measures to generate meaningful business insights.</w:t>
       </w:r>
     </w:p>
     <w:p>
@@ -996,7 +1097,7 @@
           <w:bCs/>
           <w:color w:val="000000" w:themeColor="text1"/>
         </w:rPr>
-        <w:t>Customer Churn Prediction Using Decision Tree Classification</w:t>
+        <w:t>Pantun Remix - Malay Pantun Learning Game</w:t>
       </w:r>
       <w:r>
         <w:rPr>
@@ -1027,7 +1128,77 @@
           <w:rFonts w:asciiTheme="minorBidi" w:hAnsiTheme="minorBidi" w:cstheme="minorBidi"/>
           <w:color w:val="000000" w:themeColor="text1"/>
         </w:rPr>
-        <w:t>Prepared and analysed customer data in WEKA and developed decision tree-based classification models for a Data Mining course project.</w:t>
+        <w:t xml:space="preserve">Created a web-based learning game that helps users learn and practise Malay pantun using PHP, CSS, </w:t>
+      </w:r>
+      <w:r>
+        <w:rPr>
+          <w:rFonts w:asciiTheme="minorBidi" w:hAnsiTheme="minorBidi" w:cstheme="minorBidi"/>
+          <w:color w:val="000000" w:themeColor="text1"/>
+        </w:rPr>
+        <w:t>and Laragon.</w:t>
+      </w:r>
+    </w:p>
+    <w:p>
+      <w:pPr>
+        <w:pStyle w:val="ListParagraph"/>
+        <w:numPr>
+          <w:ilvl w:val="0"/>
+          <w:numId w:val="1"/>
+        </w:numPr>
+        <w:spacing w:after="40"/>
+        <w:rPr>
+          <w:rFonts w:asciiTheme="minorBidi" w:hAnsiTheme="minorBidi" w:cstheme="minorBidi"/>
+          <w:color w:val="000000" w:themeColor="text1"/>
+        </w:rPr>
+      </w:pPr>
+      <w:r>
+        <w:rPr>
+          <w:rFonts w:asciiTheme="minorBidi" w:hAnsiTheme="minorBidi" w:cstheme="minorBidi"/>
+          <w:color w:val="000000" w:themeColor="text1"/>
+        </w:rPr>
+        <w:t xml:space="preserve">Implemented game features such as pantun matching activities, quizzes, scoring system, and user interaction elements. </w:t>
+      </w:r>
+    </w:p>
+    <w:p>
+      <w:pPr>
+        <w:pStyle w:val="ListParagraph"/>
+        <w:numPr>
+          <w:ilvl w:val="0"/>
+          <w:numId w:val="1"/>
+        </w:numPr>
+        <w:spacing w:after="40"/>
+        <w:rPr>
+          <w:rFonts w:asciiTheme="minorBidi" w:hAnsiTheme="minorBidi" w:cstheme="minorBidi"/>
+          <w:color w:val="000000" w:themeColor="text1"/>
+        </w:rPr>
+      </w:pPr>
+      <w:r>
+        <w:rPr>
+          <w:rFonts w:asciiTheme="minorBidi" w:hAnsiTheme="minorBidi" w:cstheme="minorBidi"/>
+          <w:color w:val="000000" w:themeColor="text1"/>
+        </w:rPr>
+        <w:t xml:space="preserve">Developed the application using PHP, Laravel, CSS, and database integration. </w:t>
+      </w:r>
+    </w:p>
+    <w:p>
+      <w:pPr>
+        <w:pStyle w:val="ListParagraph"/>
+        <w:numPr>
+          <w:ilvl w:val="0"/>
+          <w:numId w:val="1"/>
+        </w:numPr>
+        <w:spacing w:after="40"/>
+        <w:rPr>
+          <w:rFonts w:asciiTheme="minorBidi" w:hAnsiTheme="minorBidi" w:cstheme="minorBidi"/>
+          <w:color w:val="000000" w:themeColor="text1"/>
+        </w:rPr>
+      </w:pPr>
+      <w:r>
+        <w:rPr>
+          <w:rFonts w:asciiTheme="minorBidi" w:hAnsiTheme="minorBidi" w:cstheme="minorBidi"/>
+          <w:color w:val="000000" w:themeColor="text1"/>
+        </w:rPr>
+        <w:t>Focused on improving user engagement through a gamified learning approach.</w:t>
       </w:r>
     </w:p>
     <w:p>
@@ -1048,7 +1219,7 @@
           <w:bCs/>
           <w:color w:val="000000" w:themeColor="text1"/>
         </w:rPr>
-        <w:t>Gym Membership Management System</w:t>
+        <w:t>Customer Churn Prediction Using Decision Tree Classification</w:t>
       </w:r>
       <w:r>
         <w:rPr>
@@ -1058,39 +1229,92 @@
           <w:color w:val="000000" w:themeColor="text1"/>
         </w:rPr>
         <w:tab/>
-        <w:t>2024</w:t>
-      </w:r>
-    </w:p>
-    <w:p>
-      <w:pPr>
-        <w:pStyle w:val="ListParagraph"/>
-        <w:numPr>
-          <w:ilvl w:val="0"/>
-          <w:numId w:val="1"/>
-        </w:numPr>
-        <w:spacing w:after="40"/>
-        <w:rPr>
-          <w:rFonts w:asciiTheme="minorBidi" w:hAnsiTheme="minorBidi" w:cstheme="minorBidi"/>
-          <w:color w:val="000000" w:themeColor="text1"/>
-        </w:rPr>
-      </w:pPr>
-      <w:r>
-        <w:rPr>
-          <w:rFonts w:asciiTheme="minorBidi" w:hAnsiTheme="minorBidi" w:cstheme="minorBidi"/>
-          <w:color w:val="000000" w:themeColor="text1"/>
-        </w:rPr>
-        <w:lastRenderedPageBreak/>
-        <w:t>Developed a basic system to organise gym member information and membership records.</w:t>
-      </w:r>
-    </w:p>
-    <w:p>
-      <w:pPr>
-        <w:spacing w:after="40"/>
-        <w:rPr>
-          <w:rFonts w:asciiTheme="minorBidi" w:hAnsiTheme="minorBidi" w:cstheme="minorBidi"/>
-          <w:color w:val="000000" w:themeColor="text1"/>
-        </w:rPr>
-      </w:pPr>
+        <w:t>2025</w:t>
+      </w:r>
+    </w:p>
+    <w:p>
+      <w:pPr>
+        <w:pStyle w:val="ListParagraph"/>
+        <w:numPr>
+          <w:ilvl w:val="0"/>
+          <w:numId w:val="1"/>
+        </w:numPr>
+        <w:spacing w:after="40"/>
+        <w:rPr>
+          <w:rFonts w:asciiTheme="minorBidi" w:hAnsiTheme="minorBidi" w:cstheme="minorBidi"/>
+          <w:color w:val="000000" w:themeColor="text1"/>
+        </w:rPr>
+      </w:pPr>
+      <w:r>
+        <w:rPr>
+          <w:rFonts w:asciiTheme="minorBidi" w:hAnsiTheme="minorBidi" w:cstheme="minorBidi"/>
+          <w:color w:val="000000" w:themeColor="text1"/>
+        </w:rPr>
+        <w:t>Prepared and analysed customer data in WEKA and developed decision tree-based classification models for a Data Mining course project.</w:t>
+      </w:r>
+    </w:p>
+    <w:p>
+      <w:pPr>
+        <w:pStyle w:val="ListParagraph"/>
+        <w:numPr>
+          <w:ilvl w:val="0"/>
+          <w:numId w:val="1"/>
+        </w:numPr>
+        <w:spacing w:after="40"/>
+        <w:rPr>
+          <w:rFonts w:asciiTheme="minorBidi" w:hAnsiTheme="minorBidi" w:cstheme="minorBidi"/>
+          <w:color w:val="000000" w:themeColor="text1"/>
+        </w:rPr>
+      </w:pPr>
+      <w:r>
+        <w:rPr>
+          <w:rFonts w:asciiTheme="minorBidi" w:hAnsiTheme="minorBidi" w:cstheme="minorBidi"/>
+          <w:color w:val="000000" w:themeColor="text1"/>
+        </w:rPr>
+        <w:t xml:space="preserve">Performed data preprocessing, attribute selection, and model evaluation using WEKA. </w:t>
+      </w:r>
+    </w:p>
+    <w:p>
+      <w:pPr>
+        <w:pStyle w:val="ListParagraph"/>
+        <w:numPr>
+          <w:ilvl w:val="0"/>
+          <w:numId w:val="1"/>
+        </w:numPr>
+        <w:spacing w:after="40"/>
+        <w:rPr>
+          <w:rFonts w:asciiTheme="minorBidi" w:hAnsiTheme="minorBidi" w:cstheme="minorBidi"/>
+          <w:color w:val="000000" w:themeColor="text1"/>
+        </w:rPr>
+      </w:pPr>
+      <w:r>
+        <w:rPr>
+          <w:rFonts w:asciiTheme="minorBidi" w:hAnsiTheme="minorBidi" w:cstheme="minorBidi"/>
+          <w:color w:val="000000" w:themeColor="text1"/>
+        </w:rPr>
+        <w:t xml:space="preserve">Developed and compared decision tree classification models to predict potential customer churn. </w:t>
+      </w:r>
+    </w:p>
+    <w:p>
+      <w:pPr>
+        <w:pStyle w:val="ListParagraph"/>
+        <w:numPr>
+          <w:ilvl w:val="0"/>
+          <w:numId w:val="1"/>
+        </w:numPr>
+        <w:spacing w:after="40"/>
+        <w:rPr>
+          <w:rFonts w:asciiTheme="minorBidi" w:hAnsiTheme="minorBidi" w:cstheme="minorBidi"/>
+          <w:color w:val="000000" w:themeColor="text1"/>
+        </w:rPr>
+      </w:pPr>
+      <w:r>
+        <w:rPr>
+          <w:rFonts w:asciiTheme="minorBidi" w:hAnsiTheme="minorBidi" w:cstheme="minorBidi"/>
+          <w:color w:val="000000" w:themeColor="text1"/>
+        </w:rPr>
+        <w:t>Evaluated model performance using accuracy, confusion matrix, and classification metrics.</w:t>
+      </w:r>
     </w:p>
     <w:p>
       <w:pPr>
@@ -1103,25 +1327,14 @@
           <w:color w:val="000000" w:themeColor="text1"/>
         </w:rPr>
       </w:pPr>
-      <w:proofErr w:type="spellStart"/>
-      <w:r>
-        <w:rPr>
-          <w:rFonts w:asciiTheme="minorBidi" w:hAnsiTheme="minorBidi" w:cstheme="minorBidi"/>
-          <w:b/>
-          <w:bCs/>
-          <w:color w:val="000000" w:themeColor="text1"/>
-        </w:rPr>
-        <w:t>PowerBI</w:t>
-      </w:r>
-      <w:proofErr w:type="spellEnd"/>
-      <w:r>
-        <w:rPr>
-          <w:rFonts w:asciiTheme="minorBidi" w:hAnsiTheme="minorBidi" w:cstheme="minorBidi"/>
-          <w:b/>
-          <w:bCs/>
-          <w:color w:val="000000" w:themeColor="text1"/>
-        </w:rPr>
-        <w:t xml:space="preserve"> Dashboard Challenge</w:t>
+      <w:r>
+        <w:rPr>
+          <w:rFonts w:asciiTheme="minorBidi" w:hAnsiTheme="minorBidi" w:cstheme="minorBidi"/>
+          <w:b/>
+          <w:bCs/>
+          <w:color w:val="000000" w:themeColor="text1"/>
+        </w:rPr>
+        <w:t>Gym Membership Management System</w:t>
       </w:r>
       <w:r>
         <w:rPr>
@@ -1131,44 +1344,70 @@
           <w:color w:val="000000" w:themeColor="text1"/>
         </w:rPr>
         <w:tab/>
-        <w:t>2026</w:t>
-      </w:r>
-    </w:p>
-    <w:p>
-      <w:pPr>
-        <w:pStyle w:val="ListParagraph"/>
-        <w:numPr>
-          <w:ilvl w:val="0"/>
-          <w:numId w:val="1"/>
-        </w:numPr>
-        <w:spacing w:after="40"/>
-        <w:rPr>
-          <w:rFonts w:asciiTheme="minorBidi" w:hAnsiTheme="minorBidi" w:cstheme="minorBidi"/>
-          <w:color w:val="000000" w:themeColor="text1"/>
-        </w:rPr>
-      </w:pPr>
-      <w:r>
-        <w:rPr>
-          <w:rFonts w:asciiTheme="minorBidi" w:hAnsiTheme="minorBidi" w:cstheme="minorBidi"/>
-          <w:color w:val="000000" w:themeColor="text1"/>
-        </w:rPr>
-        <w:t xml:space="preserve">Developed an interactive Business Intelligence dashboard using Power BI and created predictive models for our </w:t>
-      </w:r>
-      <w:proofErr w:type="gramStart"/>
-      <w:r>
-        <w:rPr>
-          <w:rFonts w:asciiTheme="minorBidi" w:hAnsiTheme="minorBidi" w:cstheme="minorBidi"/>
-          <w:color w:val="000000" w:themeColor="text1"/>
-        </w:rPr>
-        <w:t>University</w:t>
-      </w:r>
-      <w:proofErr w:type="gramEnd"/>
-      <w:r>
-        <w:rPr>
-          <w:rFonts w:asciiTheme="minorBidi" w:hAnsiTheme="minorBidi" w:cstheme="minorBidi"/>
-          <w:color w:val="000000" w:themeColor="text1"/>
-        </w:rPr>
-        <w:t>.</w:t>
+        <w:t>2024</w:t>
+      </w:r>
+    </w:p>
+    <w:p>
+      <w:pPr>
+        <w:pStyle w:val="ListParagraph"/>
+        <w:numPr>
+          <w:ilvl w:val="0"/>
+          <w:numId w:val="1"/>
+        </w:numPr>
+        <w:spacing w:after="40"/>
+        <w:rPr>
+          <w:rFonts w:asciiTheme="minorBidi" w:hAnsiTheme="minorBidi" w:cstheme="minorBidi"/>
+          <w:color w:val="000000" w:themeColor="text1"/>
+        </w:rPr>
+      </w:pPr>
+      <w:r>
+        <w:rPr>
+          <w:rFonts w:asciiTheme="minorBidi" w:hAnsiTheme="minorBidi" w:cstheme="minorBidi"/>
+          <w:color w:val="000000" w:themeColor="text1"/>
+        </w:rPr>
+        <w:t xml:space="preserve">Developed a database-driven system to manage gym member information and membership records. </w:t>
+      </w:r>
+    </w:p>
+    <w:p>
+      <w:pPr>
+        <w:pStyle w:val="ListParagraph"/>
+        <w:numPr>
+          <w:ilvl w:val="0"/>
+          <w:numId w:val="1"/>
+        </w:numPr>
+        <w:spacing w:after="40"/>
+        <w:rPr>
+          <w:rFonts w:asciiTheme="minorBidi" w:hAnsiTheme="minorBidi" w:cstheme="minorBidi"/>
+          <w:color w:val="000000" w:themeColor="text1"/>
+        </w:rPr>
+      </w:pPr>
+      <w:r>
+        <w:rPr>
+          <w:rFonts w:asciiTheme="minorBidi" w:hAnsiTheme="minorBidi" w:cstheme="minorBidi"/>
+          <w:color w:val="000000" w:themeColor="text1"/>
+        </w:rPr>
+        <w:t xml:space="preserve">Implemented features including member registration, membership tracking, and record management. </w:t>
+      </w:r>
+    </w:p>
+    <w:p>
+      <w:pPr>
+        <w:pStyle w:val="ListParagraph"/>
+        <w:numPr>
+          <w:ilvl w:val="0"/>
+          <w:numId w:val="1"/>
+        </w:numPr>
+        <w:spacing w:after="40"/>
+        <w:rPr>
+          <w:rFonts w:asciiTheme="minorBidi" w:hAnsiTheme="minorBidi" w:cstheme="minorBidi"/>
+          <w:color w:val="000000" w:themeColor="text1"/>
+        </w:rPr>
+      </w:pPr>
+      <w:r>
+        <w:rPr>
+          <w:rFonts w:asciiTheme="minorBidi" w:hAnsiTheme="minorBidi" w:cstheme="minorBidi"/>
+          <w:color w:val="000000" w:themeColor="text1"/>
+        </w:rPr>
+        <w:t>Designed database structures to improve data organisation and reduce manual record keeping.</w:t>
       </w:r>
     </w:p>
     <w:p>
@@ -1525,6 +1764,7 @@
           <w:sz w:val="28"/>
           <w:szCs w:val="28"/>
         </w:rPr>
+        <w:lastRenderedPageBreak/>
         <w:t>LEADERSHIP, PARTICIPATIONS &amp; ACHIEVEMENTS</w:t>
       </w:r>
     </w:p>
@@ -1539,25 +1779,14 @@
           <w:color w:val="000000" w:themeColor="text1"/>
         </w:rPr>
       </w:pPr>
-      <w:proofErr w:type="spellStart"/>
-      <w:r>
-        <w:rPr>
-          <w:rFonts w:asciiTheme="minorBidi" w:hAnsiTheme="minorBidi" w:cstheme="minorBidi"/>
-          <w:b/>
-          <w:bCs/>
-          <w:color w:val="000000" w:themeColor="text1"/>
-        </w:rPr>
-        <w:t>Kesatria</w:t>
-      </w:r>
-      <w:proofErr w:type="spellEnd"/>
-      <w:r>
-        <w:rPr>
-          <w:rFonts w:asciiTheme="minorBidi" w:hAnsiTheme="minorBidi" w:cstheme="minorBidi"/>
-          <w:b/>
-          <w:bCs/>
-          <w:color w:val="000000" w:themeColor="text1"/>
-        </w:rPr>
-        <w:t xml:space="preserve"> Commanders Battalion, UiTM</w:t>
+      <w:r>
+        <w:rPr>
+          <w:rFonts w:asciiTheme="minorBidi" w:hAnsiTheme="minorBidi" w:cstheme="minorBidi"/>
+          <w:b/>
+          <w:bCs/>
+          <w:color w:val="000000" w:themeColor="text1"/>
+        </w:rPr>
+        <w:t>Komander Kesatria Terbaik Kampus Kuala Terengganu</w:t>
       </w:r>
       <w:r>
         <w:rPr>
@@ -1567,7 +1796,16 @@
           <w:color w:val="000000" w:themeColor="text1"/>
         </w:rPr>
         <w:tab/>
-        <w:t>2024 - Present</w:t>
+        <w:t>202</w:t>
+      </w:r>
+      <w:r>
+        <w:rPr>
+          <w:rFonts w:asciiTheme="minorBidi" w:hAnsiTheme="minorBidi" w:cstheme="minorBidi"/>
+          <w:b/>
+          <w:bCs/>
+          <w:color w:val="000000" w:themeColor="text1"/>
+        </w:rPr>
+        <w:t>6</w:t>
       </w:r>
     </w:p>
     <w:p>
@@ -1585,74 +1823,28 @@
           <w:iCs/>
           <w:color w:val="000000" w:themeColor="text1"/>
         </w:rPr>
-        <w:t>Leadership Progression</w:t>
-      </w:r>
-    </w:p>
-    <w:p>
-      <w:pPr>
-        <w:pStyle w:val="ListParagraph"/>
-        <w:numPr>
-          <w:ilvl w:val="0"/>
-          <w:numId w:val="1"/>
-        </w:numPr>
-        <w:spacing w:after="40"/>
-        <w:rPr>
-          <w:rFonts w:asciiTheme="minorBidi" w:hAnsiTheme="minorBidi" w:cstheme="minorBidi"/>
-          <w:color w:val="000000" w:themeColor="text1"/>
-        </w:rPr>
-      </w:pPr>
-      <w:r>
-        <w:rPr>
-          <w:rFonts w:asciiTheme="minorBidi" w:hAnsiTheme="minorBidi" w:cstheme="minorBidi"/>
-          <w:color w:val="000000" w:themeColor="text1"/>
-        </w:rPr>
-        <w:t>Second-in-Command (2IC), 2026 - Present: Supports the Commander in coordinating operations, maintaining discipline, and leading battalion members.</w:t>
-      </w:r>
-    </w:p>
-    <w:p>
-      <w:pPr>
-        <w:pStyle w:val="ListParagraph"/>
-        <w:numPr>
-          <w:ilvl w:val="0"/>
-          <w:numId w:val="1"/>
-        </w:numPr>
-        <w:spacing w:after="40"/>
-        <w:rPr>
-          <w:rFonts w:asciiTheme="minorBidi" w:hAnsiTheme="minorBidi" w:cstheme="minorBidi"/>
-          <w:color w:val="000000" w:themeColor="text1"/>
-        </w:rPr>
-      </w:pPr>
-      <w:proofErr w:type="spellStart"/>
-      <w:r>
-        <w:rPr>
-          <w:rFonts w:asciiTheme="minorBidi" w:hAnsiTheme="minorBidi" w:cstheme="minorBidi"/>
-          <w:color w:val="000000" w:themeColor="text1"/>
-        </w:rPr>
-        <w:t>Pegawai</w:t>
-      </w:r>
-      <w:proofErr w:type="spellEnd"/>
-      <w:r>
-        <w:rPr>
-          <w:rFonts w:asciiTheme="minorBidi" w:hAnsiTheme="minorBidi" w:cstheme="minorBidi"/>
-          <w:color w:val="000000" w:themeColor="text1"/>
-        </w:rPr>
-        <w:t xml:space="preserve"> </w:t>
-      </w:r>
-      <w:proofErr w:type="spellStart"/>
-      <w:r>
-        <w:rPr>
-          <w:rFonts w:asciiTheme="minorBidi" w:hAnsiTheme="minorBidi" w:cstheme="minorBidi"/>
-          <w:color w:val="000000" w:themeColor="text1"/>
-        </w:rPr>
-        <w:t>Latih</w:t>
-      </w:r>
-      <w:proofErr w:type="spellEnd"/>
-      <w:r>
-        <w:rPr>
-          <w:rFonts w:asciiTheme="minorBidi" w:hAnsiTheme="minorBidi" w:cstheme="minorBidi"/>
-          <w:color w:val="000000" w:themeColor="text1"/>
-        </w:rPr>
-        <w:t xml:space="preserve"> / Trainee Officer, 2024 - 2025: Completed structured foundational training in leadership, teamwork, discipline, and operational planning.</w:t>
+        <w:t xml:space="preserve">Komander Kesatria </w:t>
+      </w:r>
+    </w:p>
+    <w:p>
+      <w:pPr>
+        <w:pStyle w:val="ListParagraph"/>
+        <w:numPr>
+          <w:ilvl w:val="0"/>
+          <w:numId w:val="1"/>
+        </w:numPr>
+        <w:spacing w:after="40"/>
+        <w:rPr>
+          <w:rFonts w:asciiTheme="minorBidi" w:hAnsiTheme="minorBidi" w:cstheme="minorBidi"/>
+          <w:color w:val="000000" w:themeColor="text1"/>
+        </w:rPr>
+      </w:pPr>
+      <w:r>
+        <w:rPr>
+          <w:rFonts w:asciiTheme="minorBidi" w:hAnsiTheme="minorBidi" w:cstheme="minorBidi"/>
+          <w:color w:val="000000" w:themeColor="text1"/>
+        </w:rPr>
+        <w:t>Recognised as Komander Terbaik Kuala Terengganu for demonstrating outstanding leadership, discipline, teamwork, commitment, and responsibility throughout the programme.</w:t>
       </w:r>
     </w:p>
     <w:p>
@@ -1673,7 +1865,7 @@
           <w:bCs/>
           <w:color w:val="000000" w:themeColor="text1"/>
         </w:rPr>
-        <w:t>3rd Place - Extreme Outdoor Quest (Mountain Bike)</w:t>
+        <w:t>Kesatria Commanders Battalion, UiTM</w:t>
       </w:r>
       <w:r>
         <w:rPr>
@@ -1683,7 +1875,7 @@
           <w:color w:val="000000" w:themeColor="text1"/>
         </w:rPr>
         <w:tab/>
-        <w:t>2024</w:t>
+        <w:t>2024 - Present</w:t>
       </w:r>
     </w:p>
     <w:p>
@@ -1694,7 +1886,6 @@
           <w:color w:val="000000" w:themeColor="text1"/>
         </w:rPr>
       </w:pPr>
-      <w:proofErr w:type="spellStart"/>
       <w:r>
         <w:rPr>
           <w:rFonts w:asciiTheme="minorBidi" w:hAnsiTheme="minorBidi" w:cstheme="minorBidi"/>
@@ -1702,58 +1893,49 @@
           <w:iCs/>
           <w:color w:val="000000" w:themeColor="text1"/>
         </w:rPr>
-        <w:t>Komander</w:t>
-      </w:r>
-      <w:proofErr w:type="spellEnd"/>
-      <w:r>
-        <w:rPr>
-          <w:rFonts w:asciiTheme="minorBidi" w:hAnsiTheme="minorBidi" w:cstheme="minorBidi"/>
-          <w:i/>
-          <w:iCs/>
-          <w:color w:val="000000" w:themeColor="text1"/>
-        </w:rPr>
-        <w:t xml:space="preserve"> </w:t>
-      </w:r>
-      <w:proofErr w:type="spellStart"/>
-      <w:r>
-        <w:rPr>
-          <w:rFonts w:asciiTheme="minorBidi" w:hAnsiTheme="minorBidi" w:cstheme="minorBidi"/>
-          <w:i/>
-          <w:iCs/>
-          <w:color w:val="000000" w:themeColor="text1"/>
-        </w:rPr>
-        <w:t>Kesatria</w:t>
-      </w:r>
-      <w:proofErr w:type="spellEnd"/>
-      <w:r>
-        <w:rPr>
-          <w:rFonts w:asciiTheme="minorBidi" w:hAnsiTheme="minorBidi" w:cstheme="minorBidi"/>
-          <w:i/>
-          <w:iCs/>
-          <w:color w:val="000000" w:themeColor="text1"/>
-        </w:rPr>
-        <w:t xml:space="preserve"> Endurance Challenge (KKEC)</w:t>
-      </w:r>
-    </w:p>
-    <w:p>
-      <w:pPr>
-        <w:pStyle w:val="ListParagraph"/>
-        <w:numPr>
-          <w:ilvl w:val="0"/>
-          <w:numId w:val="1"/>
-        </w:numPr>
-        <w:spacing w:after="40"/>
-        <w:rPr>
-          <w:rFonts w:asciiTheme="minorBidi" w:hAnsiTheme="minorBidi" w:cstheme="minorBidi"/>
-          <w:color w:val="000000" w:themeColor="text1"/>
-        </w:rPr>
-      </w:pPr>
-      <w:r>
-        <w:rPr>
-          <w:rFonts w:asciiTheme="minorBidi" w:hAnsiTheme="minorBidi" w:cstheme="minorBidi"/>
-          <w:color w:val="000000" w:themeColor="text1"/>
-        </w:rPr>
-        <w:t>Achieved third place against participants from multiple UiTM campuses in a demanding endurance and navigation event.</w:t>
+        <w:t>Leadership Progression</w:t>
+      </w:r>
+    </w:p>
+    <w:p>
+      <w:pPr>
+        <w:pStyle w:val="ListParagraph"/>
+        <w:numPr>
+          <w:ilvl w:val="0"/>
+          <w:numId w:val="1"/>
+        </w:numPr>
+        <w:spacing w:after="40"/>
+        <w:rPr>
+          <w:rFonts w:asciiTheme="minorBidi" w:hAnsiTheme="minorBidi" w:cstheme="minorBidi"/>
+          <w:color w:val="000000" w:themeColor="text1"/>
+        </w:rPr>
+      </w:pPr>
+      <w:r>
+        <w:rPr>
+          <w:rFonts w:asciiTheme="minorBidi" w:hAnsiTheme="minorBidi" w:cstheme="minorBidi"/>
+          <w:color w:val="000000" w:themeColor="text1"/>
+        </w:rPr>
+        <w:t>Second-in-Command (2IC), 2026 - Present: Supports the Commander in coordinating operations, maintaining discipline, and leading battalion members.</w:t>
+      </w:r>
+    </w:p>
+    <w:p>
+      <w:pPr>
+        <w:pStyle w:val="ListParagraph"/>
+        <w:numPr>
+          <w:ilvl w:val="0"/>
+          <w:numId w:val="1"/>
+        </w:numPr>
+        <w:spacing w:after="40"/>
+        <w:rPr>
+          <w:rFonts w:asciiTheme="minorBidi" w:hAnsiTheme="minorBidi" w:cstheme="minorBidi"/>
+          <w:color w:val="000000" w:themeColor="text1"/>
+        </w:rPr>
+      </w:pPr>
+      <w:r>
+        <w:rPr>
+          <w:rFonts w:asciiTheme="minorBidi" w:hAnsiTheme="minorBidi" w:cstheme="minorBidi"/>
+          <w:color w:val="000000" w:themeColor="text1"/>
+        </w:rPr>
+        <w:t>Pegawai Latih / Trainee Officer, 2024 - 2025: Completed structured foundational training in leadership, teamwork, discipline, and operational planning.</w:t>
       </w:r>
     </w:p>
     <w:p>
@@ -1774,7 +1956,7 @@
           <w:bCs/>
           <w:color w:val="000000" w:themeColor="text1"/>
         </w:rPr>
-        <w:t>PRIDE Showcase 13.0</w:t>
+        <w:t>3rd Place - Extreme Outdoor Quest (Mountain Bike)</w:t>
       </w:r>
       <w:r>
         <w:rPr>
@@ -1784,7 +1966,7 @@
           <w:color w:val="000000" w:themeColor="text1"/>
         </w:rPr>
         <w:tab/>
-        <w:t>2026</w:t>
+        <w:t>2024</w:t>
       </w:r>
     </w:p>
     <w:p>
@@ -1802,48 +1984,28 @@
           <w:iCs/>
           <w:color w:val="000000" w:themeColor="text1"/>
         </w:rPr>
-        <w:t xml:space="preserve">Universiti </w:t>
-      </w:r>
-      <w:proofErr w:type="spellStart"/>
-      <w:r>
-        <w:rPr>
-          <w:rFonts w:asciiTheme="minorBidi" w:hAnsiTheme="minorBidi" w:cstheme="minorBidi"/>
-          <w:i/>
-          <w:iCs/>
-          <w:color w:val="000000" w:themeColor="text1"/>
-        </w:rPr>
-        <w:t>Teknologi</w:t>
-      </w:r>
-      <w:proofErr w:type="spellEnd"/>
-      <w:r>
-        <w:rPr>
-          <w:rFonts w:asciiTheme="minorBidi" w:hAnsiTheme="minorBidi" w:cstheme="minorBidi"/>
-          <w:i/>
-          <w:iCs/>
-          <w:color w:val="000000" w:themeColor="text1"/>
-        </w:rPr>
-        <w:t xml:space="preserve"> MARA</w:t>
-      </w:r>
-    </w:p>
-    <w:p>
-      <w:pPr>
-        <w:pStyle w:val="ListParagraph"/>
-        <w:numPr>
-          <w:ilvl w:val="0"/>
-          <w:numId w:val="1"/>
-        </w:numPr>
-        <w:spacing w:after="40"/>
-        <w:rPr>
-          <w:rFonts w:asciiTheme="minorBidi" w:hAnsiTheme="minorBidi" w:cstheme="minorBidi"/>
-          <w:color w:val="000000" w:themeColor="text1"/>
-        </w:rPr>
-      </w:pPr>
-      <w:r>
-        <w:rPr>
-          <w:rFonts w:asciiTheme="minorBidi" w:hAnsiTheme="minorBidi" w:cstheme="minorBidi"/>
-          <w:color w:val="000000" w:themeColor="text1"/>
-        </w:rPr>
-        <w:t>Participated in a university innovation showcase focused on computing, entrepreneurship, project demonstration, and presentation skills.</w:t>
+        <w:t>Komander Kesatria Endurance Challenge (KKEC)</w:t>
+      </w:r>
+    </w:p>
+    <w:p>
+      <w:pPr>
+        <w:pStyle w:val="ListParagraph"/>
+        <w:numPr>
+          <w:ilvl w:val="0"/>
+          <w:numId w:val="1"/>
+        </w:numPr>
+        <w:spacing w:after="40"/>
+        <w:rPr>
+          <w:rFonts w:asciiTheme="minorBidi" w:hAnsiTheme="minorBidi" w:cstheme="minorBidi"/>
+          <w:color w:val="000000" w:themeColor="text1"/>
+        </w:rPr>
+      </w:pPr>
+      <w:r>
+        <w:rPr>
+          <w:rFonts w:asciiTheme="minorBidi" w:hAnsiTheme="minorBidi" w:cstheme="minorBidi"/>
+          <w:color w:val="000000" w:themeColor="text1"/>
+        </w:rPr>
+        <w:t>Achieved third place against participants from multiple UiTM campuses in a demanding endurance and navigation event.</w:t>
       </w:r>
     </w:p>
     <w:p>
@@ -1913,7 +2075,7 @@
 </file>
 
 <file path=word/numbering.xml><?xml version="1.0" encoding="utf-8"?>
-<w:numbering xmlns:wpc="http://schemas.microsoft.com/office/word/2010/wordprocessingCanvas" xmlns:cx="http://schemas.microsoft.com/office/drawing/2014/chartex" xmlns:cx1="http://schemas.microsoft.com/office/drawing/2015/9/8/chartex" xmlns:cx2="http://schemas.microsoft.com/office/drawing/2015/10/21/chartex" xmlns:cx3="http://schemas.microsoft.com/office/drawing/2016/5/9/chartex" xmlns:cx4="http://schemas.microsoft.com/office/drawing/2016/5/10/chartex" xmlns:cx5="http://schemas.microsoft.com/office/drawing/2016/5/11/chartex" xmlns:cx6="http://schemas.microsoft.com/office/drawing/2016/5/12/chartex" xmlns:cx7="http://schemas.microsoft.com/office/drawing/2016/5/13/chartex" xmlns:cx8="http://schemas.microsoft.com/office/drawing/2016/5/14/chartex" xmlns:mc="http://schemas.openxmlformats.org/markup-compatibility/2006" xmlns:aink="http://schemas.microsoft.com/office/drawing/2016/ink" xmlns:am3d="http://schemas.microsoft.com/office/drawing/2017/model3d" xmlns:o="urn:schemas-microsoft-com:office:office" xmlns:oel="http://schemas.microsoft.com/office/2019/extlst" xmlns:r="http://schemas.openxmlformats.org/officeDocument/2006/relationships" xmlns:m="http://schemas.openxmlformats.org/officeDocument/2006/math" xmlns:v="urn:schemas-microsoft-com:vml" xmlns:wp14="http://schemas.microsoft.com/office/word/2010/wordprocessingDrawing" xmlns:wp="http://schemas.openxmlformats.org/drawingml/2006/wordprocessingDrawing" xmlns:w10="urn:schemas-microsoft-com:office:word" xmlns:w="http://schemas.openxmlformats.org/wordprocessingml/2006/main" xmlns:w14="http://schemas.microsoft.com/office/word/2010/wordml" xmlns:w15="http://schemas.microsoft.com/office/word/2012/wordml" xmlns:w16cei="http://schemas.microsoft.com/office/word/2026/wordml/cei" xmlns:w16cex="http://schemas.microsoft.com/office/word/2018/wordml/cex" xmlns:w16cid="http://schemas.microsoft.com/office/word/2016/wordml/cid" xmlns:w16="http://schemas.microsoft.com/office/word/2018/wordml" xmlns:w16du="http://schemas.microsoft.com/office/word/2023/wordml/word16du" xmlns:w16sdtdh="http://schemas.microsoft.com/office/word/2020/wordml/sdtdatahash" xmlns:w16sdtfl="http://schemas.microsoft.com/office/word/2024/wordml/sdtformatlock" xmlns:w16se="http://schemas.microsoft.com/office/word/2015/wordml/symex" xmlns:wpg="http://schemas.microsoft.com/office/word/2010/wordprocessingGroup" xmlns:wpi="http://schemas.microsoft.com/office/word/2010/wordprocessingInk" xmlns:wne="http://schemas.microsoft.com/office/word/2006/wordml" xmlns:wps="http://schemas.microsoft.com/office/word/2010/wordprocessingShape" mc:Ignorable="w14 w15 w16se w16cid w16 w16cex w16sdtdh w16sdtfl w16du wp14">
+<w:numbering xmlns:wpc="http://schemas.microsoft.com/office/word/2010/wordprocessingCanvas" xmlns:cx="http://schemas.microsoft.com/office/drawing/2014/chartex" xmlns:cx1="http://schemas.microsoft.com/office/drawing/2015/9/8/chartex" xmlns:cx2="http://schemas.microsoft.com/office/drawing/2015/10/21/chartex" xmlns:cx3="http://schemas.microsoft.com/office/drawing/2016/5/9/chartex" xmlns:cx4="http://schemas.microsoft.com/office/drawing/2016/5/10/chartex" xmlns:cx5="http://schemas.microsoft.com/office/drawing/2016/5/11/chartex" xmlns:cx6="http://schemas.microsoft.com/office/drawing/2016/5/12/chartex" xmlns:cx7="http://schemas.microsoft.com/office/drawing/2016/5/13/chartex" xmlns:cx8="http://schemas.microsoft.com/office/drawing/2016/5/14/chartex" xmlns:mc="http://schemas.openxmlformats.org/markup-compatibility/2006" xmlns:aink="http://schemas.microsoft.com/office/drawing/2016/ink" xmlns:am3d="http://schemas.microsoft.com/office/drawing/2017/model3d" xmlns:o="urn:schemas-microsoft-com:office:office" xmlns:oel="http://schemas.microsoft.com/office/2019/extlst" xmlns:r="http://schemas.openxmlformats.org/officeDocument/2006/relationships" xmlns:m="http://schemas.openxmlformats.org/officeDocument/2006/math" xmlns:v="urn:schemas-microsoft-com:vml" xmlns:wp14="http://schemas.microsoft.com/office/word/2010/wordprocessingDrawing" xmlns:wp="http://schemas.openxmlformats.org/drawingml/2006/wordprocessingDrawing" xmlns:w10="urn:schemas-microsoft-com:office:word" xmlns:w="http://schemas.openxmlformats.org/wordprocessingml/2006/main" xmlns:w14="http://schemas.microsoft.com/office/word/2010/wordml" xmlns:w15="http://schemas.microsoft.com/office/word/2012/wordml" xmlns:w16cex="http://schemas.microsoft.com/office/word/2018/wordml/cex" xmlns:w16cid="http://schemas.microsoft.com/office/word/2016/wordml/cid" xmlns:w16="http://schemas.microsoft.com/office/word/2018/wordml" xmlns:w16du="http://schemas.microsoft.com/office/word/2023/wordml/word16du" xmlns:w16sdtdh="http://schemas.microsoft.com/office/word/2020/wordml/sdtdatahash" xmlns:w16sdtfl="http://schemas.microsoft.com/office/word/2024/wordml/sdtformatlock" xmlns:w16se="http://schemas.microsoft.com/office/word/2015/wordml/symex" xmlns:wpg="http://schemas.microsoft.com/office/word/2010/wordprocessingGroup" xmlns:wpi="http://schemas.microsoft.com/office/word/2010/wordprocessingInk" xmlns:wne="http://schemas.microsoft.com/office/word/2006/wordml" xmlns:wps="http://schemas.microsoft.com/office/word/2010/wordprocessingShape" mc:Ignorable="w14 w15 w16se w16cid w16 w16cex w16sdtdh w16sdtfl w16du wp14">
   <w:abstractNum w:abstractNumId="0" w15:restartNumberingAfterBreak="0">
     <w:nsid w:val="56681A07"/>
     <w:multiLevelType w:val="hybridMultilevel"/>
@@ -2489,7 +2651,6 @@
   <w:style w:type="character" w:default="1" w:styleId="DefaultParagraphFont">
     <w:name w:val="Default Paragraph Font"/>
     <w:uiPriority w:val="1"/>
-    <w:semiHidden/>
     <w:unhideWhenUsed/>
   </w:style>
   <w:style w:type="table" w:default="1" w:styleId="TableNormal">

</xml_diff>